<commit_message>
feat(lecturer): separate pending KPI breakdown, add at-risk attendance badges, and polish empty states
</commit_message>
<xml_diff>
--- a/backend/InternLink/InternLink.API/Templates/Bao cao tong ket cong tac thuc tap tot nghiep.docx
+++ b/backend/InternLink/InternLink.API/Templates/Bao cao tong ket cong tac thuc tap tot nghiep.docx
@@ -2,341 +2,303 @@
 <file path=word/document.xml><?xml version="1.0" encoding="utf-8"?>
 <w:document xmlns:wpc="http://schemas.microsoft.com/office/word/2010/wordprocessingCanvas" xmlns:cx="http://schemas.microsoft.com/office/drawing/2014/chartex" xmlns:cx1="http://schemas.microsoft.com/office/drawing/2015/9/8/chartex" xmlns:cx2="http://schemas.microsoft.com/office/drawing/2015/10/21/chartex" xmlns:cx3="http://schemas.microsoft.com/office/drawing/2016/5/9/chartex" xmlns:cx4="http://schemas.microsoft.com/office/drawing/2016/5/10/chartex" xmlns:cx5="http://schemas.microsoft.com/office/drawing/2016/5/11/chartex" xmlns:cx6="http://schemas.microsoft.com/office/drawing/2016/5/12/chartex" xmlns:cx7="http://schemas.microsoft.com/office/drawing/2016/5/13/chartex" xmlns:cx8="http://schemas.microsoft.com/office/drawing/2016/5/14/chartex" xmlns:mc="http://schemas.openxmlformats.org/markup-compatibility/2006" xmlns:aink="http://schemas.microsoft.com/office/drawing/2016/ink" xmlns:am3d="http://schemas.microsoft.com/office/drawing/2017/model3d" xmlns:o="urn:schemas-microsoft-com:office:office" xmlns:oel="http://schemas.microsoft.com/office/2019/extlst" xmlns:r="http://schemas.openxmlformats.org/officeDocument/2006/relationships" xmlns:m="http://schemas.openxmlformats.org/officeDocument/2006/math" xmlns:v="urn:schemas-microsoft-com:vml" xmlns:wp14="http://schemas.microsoft.com/office/word/2010/wordprocessingDrawing" xmlns:wp="http://schemas.openxmlformats.org/drawingml/2006/wordprocessingDrawing" xmlns:w10="urn:schemas-microsoft-com:office:word" xmlns:w="http://schemas.openxmlformats.org/wordprocessingml/2006/main" xmlns:w14="http://schemas.microsoft.com/office/word/2010/wordml" xmlns:w15="http://schemas.microsoft.com/office/word/2012/wordml" xmlns:w16cex="http://schemas.microsoft.com/office/word/2018/wordml/cex" xmlns:w16cid="http://schemas.microsoft.com/office/word/2016/wordml/cid" xmlns:w16="http://schemas.microsoft.com/office/word/2018/wordml" xmlns:w16du="http://schemas.microsoft.com/office/word/2023/wordml/word16du" xmlns:w16sdtdh="http://schemas.microsoft.com/office/word/2020/wordml/sdtdatahash" xmlns:w16sdtfl="http://schemas.microsoft.com/office/word/2024/wordml/sdtformatlock" xmlns:w16se="http://schemas.microsoft.com/office/word/2015/wordml/symex" xmlns:wpg="http://schemas.microsoft.com/office/word/2010/wordprocessingGroup" xmlns:wpi="http://schemas.microsoft.com/office/word/2010/wordprocessingInk" xmlns:wne="http://schemas.microsoft.com/office/word/2006/wordml" xmlns:wps="http://schemas.microsoft.com/office/word/2010/wordprocessingShape" mc:Ignorable="w14 w15 w16se w16cid w16 w16cex w16sdtdh w16sdtfl w16du wp14">
   <w:body>
-    <w:p>
-      <w:pPr>
-        <w:pStyle w:val="NoSpacing"/>
-        <w:tabs>
-          <w:tab w:val="center" w:pos="1701"/>
-          <w:tab w:val="center" w:pos="6804"/>
-        </w:tabs>
-        <w:rPr>
-          <w:b/>
-          <w:sz w:val="26"/>
-          <w:szCs w:val="26"/>
-        </w:rPr>
-      </w:pPr>
-      <w:r>
-        <w:rPr>
-          <w:sz w:val="26"/>
-          <w:szCs w:val="26"/>
-        </w:rPr>
-        <w:tab/>
-        <w:t>TRƯỜNG CAO ĐẲNG GTVT</w:t>
-      </w:r>
-      <w:r>
-        <w:rPr>
-          <w:sz w:val="26"/>
-          <w:szCs w:val="26"/>
-        </w:rPr>
-        <w:tab/>
-      </w:r>
-      <w:r>
-        <w:rPr>
-          <w:b/>
-          <w:sz w:val="26"/>
-          <w:szCs w:val="26"/>
-        </w:rPr>
-        <w:t>CỘNG HÒA XÃ HỘI CHỦ NGHĨA VIỆT NAM</w:t>
-      </w:r>
-    </w:p>
-    <w:p>
-      <w:pPr>
-        <w:pStyle w:val="NoSpacing"/>
-        <w:tabs>
-          <w:tab w:val="center" w:pos="1701"/>
-          <w:tab w:val="center" w:pos="6804"/>
-        </w:tabs>
-        <w:rPr>
-          <w:b/>
-          <w:sz w:val="26"/>
-          <w:szCs w:val="26"/>
-        </w:rPr>
-      </w:pPr>
-      <w:r>
-        <w:rPr>
-          <w:b/>
-          <w:sz w:val="26"/>
-          <w:szCs w:val="26"/>
-        </w:rPr>
-        <w:tab/>
-      </w:r>
-      <w:r>
-        <w:rPr>
-          <w:b/>
-          <w:noProof/>
-          <w:sz w:val="26"/>
-          <w:szCs w:val="26"/>
-        </w:rPr>
-        <mc:AlternateContent>
-          <mc:Choice Requires="wps">
-            <w:drawing>
-              <wp:anchor distT="0" distB="0" distL="114300" distR="114300" simplePos="0" relativeHeight="251660288" behindDoc="0" locked="0" layoutInCell="1" allowOverlap="1" wp14:anchorId="0C234C68" wp14:editId="4136ED80">
-                <wp:simplePos x="0" y="0"/>
-                <wp:positionH relativeFrom="column">
-                  <wp:posOffset>3352800</wp:posOffset>
-                </wp:positionH>
-                <wp:positionV relativeFrom="paragraph">
-                  <wp:posOffset>215265</wp:posOffset>
-                </wp:positionV>
-                <wp:extent cx="1976120" cy="0"/>
-                <wp:effectExtent l="8255" t="9525" r="6350" b="9525"/>
-                <wp:wrapNone/>
-                <wp:docPr id="10" name="Straight Arrow Connector 10"/>
-                <wp:cNvGraphicFramePr>
-                  <a:graphicFrameLocks xmlns:a="http://schemas.openxmlformats.org/drawingml/2006/main"/>
-                </wp:cNvGraphicFramePr>
-                <a:graphic xmlns:a="http://schemas.openxmlformats.org/drawingml/2006/main">
-                  <a:graphicData uri="http://schemas.microsoft.com/office/word/2010/wordprocessingShape">
-                    <wps:wsp>
-                      <wps:cNvCnPr>
-                        <a:cxnSpLocks noChangeShapeType="1"/>
-                      </wps:cNvCnPr>
-                      <wps:spPr bwMode="auto">
-                        <a:xfrm>
-                          <a:off x="0" y="0"/>
-                          <a:ext cx="1976120" cy="0"/>
-                        </a:xfrm>
-                        <a:prstGeom prst="straightConnector1">
-                          <a:avLst/>
-                        </a:prstGeom>
-                        <a:noFill/>
-                        <a:ln w="9525">
-                          <a:solidFill>
-                            <a:srgbClr val="000000"/>
-                          </a:solidFill>
-                          <a:round/>
-                          <a:headEnd/>
-                          <a:tailEnd/>
-                        </a:ln>
-                        <a:extLst>
-                          <a:ext uri="{909E8E84-426E-40DD-AFC4-6F175D3DCCD1}">
-                            <a14:hiddenFill xmlns:a14="http://schemas.microsoft.com/office/drawing/2010/main">
+    <w:tbl>
+      <w:tblPr>
+        <w:tblStyle w:val="TableGrid"/>
+        <w:tblW w:w="0" w:type="auto"/>
+        <w:tblBorders>
+          <w:top w:val="none" w:sz="0" w:space="0" w:color="auto"/>
+          <w:left w:val="none" w:sz="0" w:space="0" w:color="auto"/>
+          <w:bottom w:val="none" w:sz="0" w:space="0" w:color="auto"/>
+          <w:right w:val="none" w:sz="0" w:space="0" w:color="auto"/>
+          <w:insideH w:val="none" w:sz="0" w:space="0" w:color="auto"/>
+          <w:insideV w:val="none" w:sz="0" w:space="0" w:color="auto"/>
+        </w:tblBorders>
+        <w:tblLook w:val="04A0" w:firstRow="1" w:lastRow="0" w:firstColumn="1" w:lastColumn="0" w:noHBand="0" w:noVBand="1"/>
+      </w:tblPr>
+      <w:tblGrid>
+        <w:gridCol w:w="3685"/>
+        <w:gridCol w:w="5660"/>
+      </w:tblGrid>
+      <w:tr>
+        <w:tc>
+          <w:tcPr>
+            <w:tcW w:w="3685" w:type="dxa"/>
+          </w:tcPr>
+          <w:p>
+            <w:pPr>
+              <w:pStyle w:val="NoSpacing"/>
+              <w:tabs>
+                <w:tab w:val="center" w:pos="1701"/>
+                <w:tab w:val="center" w:pos="6804"/>
+              </w:tabs>
+              <w:jc w:val="center"/>
+              <w:rPr>
+                <w:sz w:val="26"/>
+                <w:szCs w:val="26"/>
+              </w:rPr>
+            </w:pPr>
+            <w:r>
+              <w:rPr>
+                <w:sz w:val="26"/>
+                <w:szCs w:val="26"/>
+              </w:rPr>
+              <w:t>TRƯỜNG CAO ĐẲNG GTVT</w:t>
+            </w:r>
+          </w:p>
+          <w:p>
+            <w:pPr>
+              <w:pStyle w:val="NoSpacing"/>
+              <w:tabs>
+                <w:tab w:val="center" w:pos="1701"/>
+                <w:tab w:val="center" w:pos="6804"/>
+              </w:tabs>
+              <w:jc w:val="center"/>
+              <w:rPr>
+                <w:b/>
+                <w:sz w:val="26"/>
+                <w:szCs w:val="26"/>
+              </w:rPr>
+            </w:pPr>
+            <w:r>
+              <w:rPr>
+                <w:b/>
+                <w:sz w:val="26"/>
+                <w:szCs w:val="26"/>
+              </w:rPr>
+              <w:t xml:space="preserve">KHOA </w:t>
+            </w:r>
+            <w:r>
+              <w:rPr>
+                <w:b/>
+                <w:sz w:val="26"/>
+                <w:szCs w:val="26"/>
+              </w:rPr>
+              <w:t>{TEN_KHOA}</w:t>
+            </w:r>
+          </w:p>
+          <w:p>
+            <w:pPr>
+              <w:pStyle w:val="NoSpacing"/>
+              <w:tabs>
+                <w:tab w:val="center" w:pos="1701"/>
+                <w:tab w:val="center" w:pos="6804"/>
+              </w:tabs>
+              <w:rPr>
+                <w:sz w:val="26"/>
+                <w:szCs w:val="26"/>
+              </w:rPr>
+            </w:pPr>
+            <w:r>
+              <w:rPr>
+                <w:b/>
+                <w:noProof/>
+                <w:sz w:val="26"/>
+                <w:szCs w:val="26"/>
+              </w:rPr>
+              <mc:AlternateContent>
+                <mc:Choice Requires="wps">
+                  <w:drawing>
+                    <wp:anchor distT="0" distB="0" distL="114300" distR="114300" simplePos="0" relativeHeight="251662336" behindDoc="0" locked="0" layoutInCell="1" allowOverlap="1" wp14:anchorId="5A71DD3F" wp14:editId="4C6987AE">
+                      <wp:simplePos x="0" y="0"/>
+                      <wp:positionH relativeFrom="column">
+                        <wp:posOffset>495300</wp:posOffset>
+                      </wp:positionH>
+                      <wp:positionV relativeFrom="paragraph">
+                        <wp:posOffset>56515</wp:posOffset>
+                      </wp:positionV>
+                      <wp:extent cx="1109980" cy="0"/>
+                      <wp:effectExtent l="13970" t="9525" r="9525" b="9525"/>
+                      <wp:wrapNone/>
+                      <wp:docPr id="1832422407" name="Straight Arrow Connector 1832422407"/>
+                      <wp:cNvGraphicFramePr>
+                        <a:graphicFrameLocks xmlns:a="http://schemas.openxmlformats.org/drawingml/2006/main"/>
+                      </wp:cNvGraphicFramePr>
+                      <a:graphic xmlns:a="http://schemas.openxmlformats.org/drawingml/2006/main">
+                        <a:graphicData uri="http://schemas.microsoft.com/office/word/2010/wordprocessingShape">
+                          <wps:wsp>
+                            <wps:cNvCnPr>
+                              <a:cxnSpLocks noChangeShapeType="1"/>
+                            </wps:cNvCnPr>
+                            <wps:spPr bwMode="auto">
+                              <a:xfrm>
+                                <a:off x="0" y="0"/>
+                                <a:ext cx="1109980" cy="0"/>
+                              </a:xfrm>
+                              <a:prstGeom prst="straightConnector1">
+                                <a:avLst/>
+                              </a:prstGeom>
                               <a:noFill/>
-                            </a14:hiddenFill>
-                          </a:ext>
-                        </a:extLst>
-                      </wps:spPr>
-                      <wps:bodyPr/>
-                    </wps:wsp>
-                  </a:graphicData>
-                </a:graphic>
-                <wp14:sizeRelH relativeFrom="page">
-                  <wp14:pctWidth>0</wp14:pctWidth>
-                </wp14:sizeRelH>
-                <wp14:sizeRelV relativeFrom="page">
-                  <wp14:pctHeight>0</wp14:pctHeight>
-                </wp14:sizeRelV>
-              </wp:anchor>
-            </w:drawing>
-          </mc:Choice>
-          <mc:Fallback>
-            <w:pict>
-              <v:shapetype w14:anchorId="44BD7468" id="_x0000_t32" coordsize="21600,21600" o:spt="32" o:oned="t" path="m,l21600,21600e" filled="f">
-                <v:path arrowok="t" fillok="f" o:connecttype="none"/>
-                <o:lock v:ext="edit" shapetype="t"/>
-              </v:shapetype>
-              <v:shape id="Straight Arrow Connector 10" o:spid="_x0000_s1026" type="#_x0000_t32" style="position:absolute;margin-left:264pt;margin-top:16.95pt;width:155.6pt;height:0;z-index:251660288;visibility:visible;mso-wrap-style:square;mso-width-percent:0;mso-height-percent:0;mso-wrap-distance-left:9pt;mso-wrap-distance-top:0;mso-wrap-distance-right:9pt;mso-wrap-distance-bottom:0;mso-position-horizontal:absolute;mso-position-horizontal-relative:text;mso-position-vertical:absolute;mso-position-vertical-relative:text;mso-width-percent:0;mso-height-percent:0;mso-width-relative:page;mso-height-relative:page" o:gfxdata="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"/>
-            </w:pict>
-          </mc:Fallback>
-        </mc:AlternateContent>
-      </w:r>
-      <w:r>
-        <w:rPr>
-          <w:b/>
-          <w:noProof/>
-          <w:sz w:val="26"/>
-          <w:szCs w:val="26"/>
-        </w:rPr>
-        <mc:AlternateContent>
-          <mc:Choice Requires="wps">
-            <w:drawing>
-              <wp:anchor distT="0" distB="0" distL="114300" distR="114300" simplePos="0" relativeHeight="251659264" behindDoc="0" locked="0" layoutInCell="1" allowOverlap="1" wp14:anchorId="7342186B" wp14:editId="49AFC7AB">
-                <wp:simplePos x="0" y="0"/>
-                <wp:positionH relativeFrom="column">
-                  <wp:posOffset>520065</wp:posOffset>
-                </wp:positionH>
-                <wp:positionV relativeFrom="paragraph">
-                  <wp:posOffset>215265</wp:posOffset>
-                </wp:positionV>
-                <wp:extent cx="1109980" cy="0"/>
-                <wp:effectExtent l="13970" t="9525" r="9525" b="9525"/>
-                <wp:wrapNone/>
-                <wp:docPr id="9" name="Straight Arrow Connector 9"/>
-                <wp:cNvGraphicFramePr>
-                  <a:graphicFrameLocks xmlns:a="http://schemas.openxmlformats.org/drawingml/2006/main"/>
-                </wp:cNvGraphicFramePr>
-                <a:graphic xmlns:a="http://schemas.openxmlformats.org/drawingml/2006/main">
-                  <a:graphicData uri="http://schemas.microsoft.com/office/word/2010/wordprocessingShape">
-                    <wps:wsp>
-                      <wps:cNvCnPr>
-                        <a:cxnSpLocks noChangeShapeType="1"/>
-                      </wps:cNvCnPr>
-                      <wps:spPr bwMode="auto">
-                        <a:xfrm>
-                          <a:off x="0" y="0"/>
-                          <a:ext cx="1109980" cy="0"/>
-                        </a:xfrm>
-                        <a:prstGeom prst="straightConnector1">
-                          <a:avLst/>
-                        </a:prstGeom>
-                        <a:noFill/>
-                        <a:ln w="9525">
-                          <a:solidFill>
-                            <a:srgbClr val="000000"/>
-                          </a:solidFill>
-                          <a:round/>
-                          <a:headEnd/>
-                          <a:tailEnd/>
-                        </a:ln>
-                        <a:extLst>
-                          <a:ext uri="{909E8E84-426E-40DD-AFC4-6F175D3DCCD1}">
-                            <a14:hiddenFill xmlns:a14="http://schemas.microsoft.com/office/drawing/2010/main">
+                              <a:ln w="9525">
+                                <a:solidFill>
+                                  <a:srgbClr val="000000"/>
+                                </a:solidFill>
+                                <a:round/>
+                                <a:headEnd/>
+                                <a:tailEnd/>
+                              </a:ln>
+                              <a:extLst>
+                                <a:ext uri="{909E8E84-426E-40DD-AFC4-6F175D3DCCD1}">
+                                  <a14:hiddenFill xmlns:a14="http://schemas.microsoft.com/office/drawing/2010/main">
+                                    <a:noFill/>
+                                  </a14:hiddenFill>
+                                </a:ext>
+                              </a:extLst>
+                            </wps:spPr>
+                            <wps:bodyPr/>
+                          </wps:wsp>
+                        </a:graphicData>
+                      </a:graphic>
+                      <wp14:sizeRelH relativeFrom="page">
+                        <wp14:pctWidth>0</wp14:pctWidth>
+                      </wp14:sizeRelH>
+                      <wp14:sizeRelV relativeFrom="page">
+                        <wp14:pctHeight>0</wp14:pctHeight>
+                      </wp14:sizeRelV>
+                    </wp:anchor>
+                  </w:drawing>
+                </mc:Choice>
+                <mc:Fallback>
+                  <w:pict>
+                    <v:shapetype w14:anchorId="72C9B5DE" id="_x0000_t32" coordsize="21600,21600" o:spt="32" o:oned="t" path="m,l21600,21600e" filled="f">
+                      <v:path arrowok="t" fillok="f" o:connecttype="none"/>
+                      <o:lock v:ext="edit" shapetype="t"/>
+                    </v:shapetype>
+                    <v:shape id="Straight Arrow Connector 1832422407" o:spid="_x0000_s1026" type="#_x0000_t32" style="position:absolute;margin-left:39pt;margin-top:4.45pt;width:87.4pt;height:0;z-index:251662336;visibility:visible;mso-wrap-style:square;mso-width-percent:0;mso-height-percent:0;mso-wrap-distance-left:9pt;mso-wrap-distance-top:0;mso-wrap-distance-right:9pt;mso-wrap-distance-bottom:0;mso-position-horizontal:absolute;mso-position-horizontal-relative:text;mso-position-vertical:absolute;mso-position-vertical-relative:text;mso-width-percent:0;mso-height-percent:0;mso-width-relative:page;mso-height-relative:page" o:gfxdata="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"/>
+                  </w:pict>
+                </mc:Fallback>
+              </mc:AlternateContent>
+            </w:r>
+          </w:p>
+        </w:tc>
+        <w:tc>
+          <w:tcPr>
+            <w:tcW w:w="5660" w:type="dxa"/>
+          </w:tcPr>
+          <w:p>
+            <w:pPr>
+              <w:pStyle w:val="NoSpacing"/>
+              <w:tabs>
+                <w:tab w:val="center" w:pos="1701"/>
+                <w:tab w:val="center" w:pos="6804"/>
+              </w:tabs>
+              <w:jc w:val="center"/>
+              <w:rPr>
+                <w:b/>
+                <w:sz w:val="26"/>
+                <w:szCs w:val="26"/>
+              </w:rPr>
+            </w:pPr>
+            <w:r>
+              <w:rPr>
+                <w:b/>
+                <w:sz w:val="26"/>
+                <w:szCs w:val="26"/>
+              </w:rPr>
+              <w:t>CỘNG HÒA XÃ HỘI CHỦ NGHĨA VIỆT NAM</w:t>
+            </w:r>
+          </w:p>
+          <w:p>
+            <w:pPr>
+              <w:pStyle w:val="NoSpacing"/>
+              <w:tabs>
+                <w:tab w:val="center" w:pos="1701"/>
+                <w:tab w:val="center" w:pos="6804"/>
+              </w:tabs>
+              <w:jc w:val="center"/>
+              <w:rPr>
+                <w:sz w:val="26"/>
+                <w:szCs w:val="26"/>
+              </w:rPr>
+            </w:pPr>
+            <w:r>
+              <w:rPr>
+                <w:b/>
+                <w:noProof/>
+                <w:sz w:val="26"/>
+                <w:szCs w:val="26"/>
+              </w:rPr>
+              <mc:AlternateContent>
+                <mc:Choice Requires="wps">
+                  <w:drawing>
+                    <wp:anchor distT="0" distB="0" distL="114300" distR="114300" simplePos="0" relativeHeight="251660288" behindDoc="0" locked="0" layoutInCell="1" allowOverlap="1" wp14:anchorId="0C234C68" wp14:editId="386CA628">
+                      <wp:simplePos x="0" y="0"/>
+                      <wp:positionH relativeFrom="column">
+                        <wp:posOffset>756920</wp:posOffset>
+                      </wp:positionH>
+                      <wp:positionV relativeFrom="paragraph">
+                        <wp:posOffset>225425</wp:posOffset>
+                      </wp:positionV>
+                      <wp:extent cx="1976120" cy="0"/>
+                      <wp:effectExtent l="8255" t="9525" r="6350" b="9525"/>
+                      <wp:wrapNone/>
+                      <wp:docPr id="10" name="Straight Arrow Connector 10"/>
+                      <wp:cNvGraphicFramePr>
+                        <a:graphicFrameLocks xmlns:a="http://schemas.openxmlformats.org/drawingml/2006/main"/>
+                      </wp:cNvGraphicFramePr>
+                      <a:graphic xmlns:a="http://schemas.openxmlformats.org/drawingml/2006/main">
+                        <a:graphicData uri="http://schemas.microsoft.com/office/word/2010/wordprocessingShape">
+                          <wps:wsp>
+                            <wps:cNvCnPr>
+                              <a:cxnSpLocks noChangeShapeType="1"/>
+                            </wps:cNvCnPr>
+                            <wps:spPr bwMode="auto">
+                              <a:xfrm>
+                                <a:off x="0" y="0"/>
+                                <a:ext cx="1976120" cy="0"/>
+                              </a:xfrm>
+                              <a:prstGeom prst="straightConnector1">
+                                <a:avLst/>
+                              </a:prstGeom>
                               <a:noFill/>
-                            </a14:hiddenFill>
-                          </a:ext>
-                        </a:extLst>
-                      </wps:spPr>
-                      <wps:bodyPr/>
-                    </wps:wsp>
-                  </a:graphicData>
-                </a:graphic>
-                <wp14:sizeRelH relativeFrom="page">
-                  <wp14:pctWidth>0</wp14:pctWidth>
-                </wp14:sizeRelH>
-                <wp14:sizeRelV relativeFrom="page">
-                  <wp14:pctHeight>0</wp14:pctHeight>
-                </wp14:sizeRelV>
-              </wp:anchor>
-            </w:drawing>
-          </mc:Choice>
-          <mc:Fallback>
-            <w:pict>
-              <v:shape w14:anchorId="397FAAFC" id="Straight Arrow Connector 9" o:spid="_x0000_s1026" type="#_x0000_t32" style="position:absolute;margin-left:40.95pt;margin-top:16.95pt;width:87.4pt;height:0;z-index:251659264;visibility:visible;mso-wrap-style:square;mso-width-percent:0;mso-height-percent:0;mso-wrap-distance-left:9pt;mso-wrap-distance-top:0;mso-wrap-distance-right:9pt;mso-wrap-distance-bottom:0;mso-position-horizontal:absolute;mso-position-horizontal-relative:text;mso-position-vertical:absolute;mso-position-vertical-relative:text;mso-width-percent:0;mso-height-percent:0;mso-width-relative:page;mso-height-relative:page" o:gfxdata="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"/>
-            </w:pict>
-          </mc:Fallback>
-        </mc:AlternateContent>
-      </w:r>
-      <w:r>
-        <w:rPr>
-          <w:b/>
-          <w:sz w:val="26"/>
-          <w:szCs w:val="26"/>
-        </w:rPr>
-        <w:t xml:space="preserve">KHOA </w:t>
-      </w:r>
-      <w:r>
-        <w:rPr>
-          <w:b/>
-          <w:sz w:val="26"/>
-          <w:szCs w:val="26"/>
-        </w:rPr>
-        <w:t>{TEN_KHOA}</w:t>
-      </w:r>
-      <w:r>
-        <w:rPr>
-          <w:b/>
-          <w:sz w:val="26"/>
-          <w:szCs w:val="26"/>
-        </w:rPr>
-        <w:tab/>
-        <w:t xml:space="preserve"> Đ</w:t>
-      </w:r>
-      <w:proofErr w:type="spellStart"/>
-      <w:r>
-        <w:rPr>
-          <w:b/>
-          <w:sz w:val="26"/>
-          <w:szCs w:val="26"/>
-        </w:rPr>
-        <w:t>ộc</w:t>
-      </w:r>
-      <w:proofErr w:type="spellEnd"/>
-      <w:r>
-        <w:rPr>
-          <w:b/>
-          <w:sz w:val="26"/>
-          <w:szCs w:val="26"/>
-        </w:rPr>
-        <w:t xml:space="preserve"> </w:t>
-      </w:r>
-      <w:proofErr w:type="spellStart"/>
-      <w:r>
-        <w:rPr>
-          <w:b/>
-          <w:sz w:val="26"/>
-          <w:szCs w:val="26"/>
-        </w:rPr>
-        <w:t>lập</w:t>
-      </w:r>
-      <w:proofErr w:type="spellEnd"/>
-      <w:r>
-        <w:rPr>
-          <w:b/>
-          <w:sz w:val="26"/>
-          <w:szCs w:val="26"/>
-        </w:rPr>
-        <w:t xml:space="preserve"> – </w:t>
-      </w:r>
-      <w:proofErr w:type="spellStart"/>
-      <w:r>
-        <w:rPr>
-          <w:b/>
-          <w:sz w:val="26"/>
-          <w:szCs w:val="26"/>
-        </w:rPr>
-        <w:t>Tự</w:t>
-      </w:r>
-      <w:proofErr w:type="spellEnd"/>
-      <w:r>
-        <w:rPr>
-          <w:b/>
-          <w:sz w:val="26"/>
-          <w:szCs w:val="26"/>
-        </w:rPr>
-        <w:t xml:space="preserve"> do – </w:t>
-      </w:r>
-      <w:proofErr w:type="spellStart"/>
-      <w:r>
-        <w:rPr>
-          <w:b/>
-          <w:sz w:val="26"/>
-          <w:szCs w:val="26"/>
-        </w:rPr>
-        <w:t>Hạnh</w:t>
-      </w:r>
-      <w:proofErr w:type="spellEnd"/>
-      <w:r>
-        <w:rPr>
-          <w:b/>
-          <w:sz w:val="26"/>
-          <w:szCs w:val="26"/>
-        </w:rPr>
-        <w:t xml:space="preserve"> </w:t>
-      </w:r>
-      <w:proofErr w:type="spellStart"/>
-      <w:r>
-        <w:rPr>
-          <w:b/>
-          <w:sz w:val="26"/>
-          <w:szCs w:val="26"/>
-        </w:rPr>
-        <w:t>phúc</w:t>
-      </w:r>
-      <w:proofErr w:type="spellEnd"/>
-    </w:p>
-    <w:p>
-      <w:pPr>
-        <w:pStyle w:val="NoSpacing"/>
-        <w:tabs>
-          <w:tab w:val="center" w:pos="1701"/>
-          <w:tab w:val="center" w:pos="6804"/>
-        </w:tabs>
-        <w:rPr>
-          <w:sz w:val="26"/>
-          <w:szCs w:val="26"/>
-        </w:rPr>
-      </w:pPr>
-    </w:p>
+                              <a:ln w="9525">
+                                <a:solidFill>
+                                  <a:srgbClr val="000000"/>
+                                </a:solidFill>
+                                <a:round/>
+                                <a:headEnd/>
+                                <a:tailEnd/>
+                              </a:ln>
+                              <a:extLst>
+                                <a:ext uri="{909E8E84-426E-40DD-AFC4-6F175D3DCCD1}">
+                                  <a14:hiddenFill xmlns:a14="http://schemas.microsoft.com/office/drawing/2010/main">
+                                    <a:noFill/>
+                                  </a14:hiddenFill>
+                                </a:ext>
+                              </a:extLst>
+                            </wps:spPr>
+                            <wps:bodyPr/>
+                          </wps:wsp>
+                        </a:graphicData>
+                      </a:graphic>
+                      <wp14:sizeRelH relativeFrom="page">
+                        <wp14:pctWidth>0</wp14:pctWidth>
+                      </wp14:sizeRelH>
+                      <wp14:sizeRelV relativeFrom="page">
+                        <wp14:pctHeight>0</wp14:pctHeight>
+                      </wp14:sizeRelV>
+                    </wp:anchor>
+                  </w:drawing>
+                </mc:Choice>
+                <mc:Fallback>
+                  <w:pict>
+                    <v:shape w14:anchorId="7A86CF33" id="Straight Arrow Connector 10" o:spid="_x0000_s1026" type="#_x0000_t32" style="position:absolute;margin-left:59.6pt;margin-top:17.75pt;width:155.6pt;height:0;z-index:251660288;visibility:visible;mso-wrap-style:square;mso-width-percent:0;mso-height-percent:0;mso-wrap-distance-left:9pt;mso-wrap-distance-top:0;mso-wrap-distance-right:9pt;mso-wrap-distance-bottom:0;mso-position-horizontal:absolute;mso-position-horizontal-relative:text;mso-position-vertical:absolute;mso-position-vertical-relative:text;mso-width-percent:0;mso-height-percent:0;mso-width-relative:page;mso-height-relative:page" o:gfxdata="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"/>
+                  </w:pict>
+                </mc:Fallback>
+              </mc:AlternateContent>
+            </w:r>
+            <w:r>
+              <w:rPr>
+                <w:b/>
+                <w:sz w:val="26"/>
+                <w:szCs w:val="26"/>
+              </w:rPr>
+              <w:t>Độc lập – Tự do – Hạnh phúc</w:t>
+            </w:r>
+          </w:p>
+        </w:tc>
+      </w:tr>
+    </w:tbl>
     <w:p>
       <w:pPr>
         <w:tabs>
@@ -371,43 +333,39 @@
           <w:sz w:val="26"/>
           <w:szCs w:val="26"/>
         </w:rPr>
-        <w:t xml:space="preserve">Tp. </w:t>
-      </w:r>
-      <w:proofErr w:type="spellStart"/>
+        <w:t xml:space="preserve">Tp. Hồ Chí Minh, ngày </w:t>
+      </w:r>
       <w:r>
         <w:rPr>
           <w:i/>
           <w:sz w:val="26"/>
           <w:szCs w:val="26"/>
         </w:rPr>
-        <w:t>Hồ</w:t>
-      </w:r>
-      <w:proofErr w:type="spellEnd"/>
+        <w:t>{NGAY}</w:t>
+      </w:r>
       <w:r>
         <w:rPr>
           <w:i/>
           <w:sz w:val="26"/>
           <w:szCs w:val="26"/>
         </w:rPr>
-        <w:t xml:space="preserve"> Chí Minh, </w:t>
-      </w:r>
-      <w:proofErr w:type="spellStart"/>
+        <w:t xml:space="preserve"> tháng </w:t>
+      </w:r>
       <w:r>
         <w:rPr>
           <w:i/>
           <w:sz w:val="26"/>
           <w:szCs w:val="26"/>
         </w:rPr>
-        <w:t>ngày</w:t>
-      </w:r>
-      <w:proofErr w:type="spellEnd"/>
+        <w:t>{THANG}</w:t>
+      </w:r>
       <w:r>
         <w:rPr>
           <w:i/>
           <w:sz w:val="26"/>
           <w:szCs w:val="26"/>
         </w:rPr>
-        <w:t xml:space="preserve"> </w:t>
+        <w:t xml:space="preserve"> năm </w:t>
       </w:r>
       <w:r>
         <w:rPr>
@@ -415,74 +373,6 @@
           <w:sz w:val="26"/>
           <w:szCs w:val="26"/>
         </w:rPr>
-        <w:t>{NGAY}</w:t>
-      </w:r>
-      <w:r>
-        <w:rPr>
-          <w:i/>
-          <w:sz w:val="26"/>
-          <w:szCs w:val="26"/>
-        </w:rPr>
-        <w:t xml:space="preserve"> </w:t>
-      </w:r>
-      <w:proofErr w:type="spellStart"/>
-      <w:r>
-        <w:rPr>
-          <w:i/>
-          <w:sz w:val="26"/>
-          <w:szCs w:val="26"/>
-        </w:rPr>
-        <w:t>tháng</w:t>
-      </w:r>
-      <w:proofErr w:type="spellEnd"/>
-      <w:r>
-        <w:rPr>
-          <w:i/>
-          <w:sz w:val="26"/>
-          <w:szCs w:val="26"/>
-        </w:rPr>
-        <w:t xml:space="preserve"> </w:t>
-      </w:r>
-      <w:r>
-        <w:rPr>
-          <w:i/>
-          <w:sz w:val="26"/>
-          <w:szCs w:val="26"/>
-        </w:rPr>
-        <w:t>{THANG}</w:t>
-      </w:r>
-      <w:r>
-        <w:rPr>
-          <w:i/>
-          <w:sz w:val="26"/>
-          <w:szCs w:val="26"/>
-        </w:rPr>
-        <w:t xml:space="preserve"> </w:t>
-      </w:r>
-      <w:proofErr w:type="spellStart"/>
-      <w:r>
-        <w:rPr>
-          <w:i/>
-          <w:sz w:val="26"/>
-          <w:szCs w:val="26"/>
-        </w:rPr>
-        <w:t>năm</w:t>
-      </w:r>
-      <w:proofErr w:type="spellEnd"/>
-      <w:r>
-        <w:rPr>
-          <w:i/>
-          <w:sz w:val="26"/>
-          <w:szCs w:val="26"/>
-        </w:rPr>
-        <w:t xml:space="preserve"> </w:t>
-      </w:r>
-      <w:r>
-        <w:rPr>
-          <w:i/>
-          <w:sz w:val="26"/>
-          <w:szCs w:val="26"/>
-        </w:rPr>
         <w:t>{NAM}</w:t>
       </w:r>
     </w:p>
@@ -511,85 +401,12 @@
         </w:rPr>
         <w:br/>
       </w:r>
-      <w:proofErr w:type="spellStart"/>
-      <w:r>
-        <w:rPr>
-          <w:b/>
-          <w:szCs w:val="28"/>
-        </w:rPr>
-        <w:t>Thời</w:t>
-      </w:r>
-      <w:proofErr w:type="spellEnd"/>
-      <w:r>
-        <w:rPr>
-          <w:b/>
-          <w:szCs w:val="28"/>
-        </w:rPr>
-        <w:t xml:space="preserve"> </w:t>
-      </w:r>
-      <w:proofErr w:type="spellStart"/>
-      <w:r>
-        <w:rPr>
-          <w:b/>
-          <w:szCs w:val="28"/>
-        </w:rPr>
-        <w:t>gian</w:t>
-      </w:r>
-      <w:proofErr w:type="spellEnd"/>
-      <w:r>
-        <w:rPr>
-          <w:b/>
-          <w:szCs w:val="28"/>
-        </w:rPr>
-        <w:t xml:space="preserve"> </w:t>
-      </w:r>
-      <w:proofErr w:type="spellStart"/>
-      <w:r>
-        <w:rPr>
-          <w:b/>
-          <w:szCs w:val="28"/>
-        </w:rPr>
-        <w:t>thực</w:t>
-      </w:r>
-      <w:proofErr w:type="spellEnd"/>
-      <w:r>
-        <w:rPr>
-          <w:b/>
-          <w:szCs w:val="28"/>
-        </w:rPr>
-        <w:t xml:space="preserve"> </w:t>
-      </w:r>
-      <w:proofErr w:type="spellStart"/>
-      <w:r>
-        <w:rPr>
-          <w:b/>
-          <w:szCs w:val="28"/>
-        </w:rPr>
-        <w:t>tập</w:t>
-      </w:r>
-      <w:proofErr w:type="spellEnd"/>
-      <w:r>
-        <w:rPr>
-          <w:b/>
-          <w:szCs w:val="28"/>
-        </w:rPr>
-        <w:t xml:space="preserve">: </w:t>
-      </w:r>
-      <w:proofErr w:type="spellStart"/>
-      <w:r>
-        <w:rPr>
-          <w:b/>
-          <w:szCs w:val="28"/>
-        </w:rPr>
-        <w:t>từ</w:t>
-      </w:r>
-      <w:proofErr w:type="spellEnd"/>
-      <w:r>
-        <w:rPr>
-          <w:b/>
-          <w:szCs w:val="28"/>
-        </w:rPr>
-        <w:t xml:space="preserve"> </w:t>
+      <w:r>
+        <w:rPr>
+          <w:b/>
+          <w:szCs w:val="28"/>
+        </w:rPr>
+        <w:t xml:space="preserve">Thời gian thực tập: từ </w:t>
       </w:r>
       <w:r>
         <w:rPr>
@@ -603,23 +420,7 @@
           <w:b/>
           <w:szCs w:val="28"/>
         </w:rPr>
-        <w:t xml:space="preserve"> </w:t>
-      </w:r>
-      <w:proofErr w:type="spellStart"/>
-      <w:r>
-        <w:rPr>
-          <w:b/>
-          <w:szCs w:val="28"/>
-        </w:rPr>
-        <w:t>đến</w:t>
-      </w:r>
-      <w:proofErr w:type="spellEnd"/>
-      <w:r>
-        <w:rPr>
-          <w:b/>
-          <w:szCs w:val="28"/>
-        </w:rPr>
-        <w:t xml:space="preserve"> </w:t>
+        <w:t xml:space="preserve"> đến </w:t>
       </w:r>
       <w:r>
         <w:rPr>
@@ -675,7 +476,6 @@
           <w:szCs w:val="28"/>
         </w:rPr>
       </w:pPr>
-      <w:proofErr w:type="spellStart"/>
       <w:r>
         <w:rPr>
           <w:rFonts w:ascii="Times New Roman" w:hAnsi="Times New Roman"/>
@@ -684,128 +484,7 @@
           <w:sz w:val="28"/>
           <w:szCs w:val="28"/>
         </w:rPr>
-        <w:t>Số</w:t>
-      </w:r>
-      <w:proofErr w:type="spellEnd"/>
-      <w:r>
-        <w:rPr>
-          <w:rFonts w:ascii="Times New Roman" w:hAnsi="Times New Roman"/>
-          <w:b/>
-          <w:bCs/>
-          <w:sz w:val="28"/>
-          <w:szCs w:val="28"/>
-        </w:rPr>
-        <w:t xml:space="preserve"> </w:t>
-      </w:r>
-      <w:proofErr w:type="spellStart"/>
-      <w:r>
-        <w:rPr>
-          <w:rFonts w:ascii="Times New Roman" w:hAnsi="Times New Roman"/>
-          <w:b/>
-          <w:bCs/>
-          <w:sz w:val="28"/>
-          <w:szCs w:val="28"/>
-        </w:rPr>
-        <w:t>lượng</w:t>
-      </w:r>
-      <w:proofErr w:type="spellEnd"/>
-      <w:r>
-        <w:rPr>
-          <w:rFonts w:ascii="Times New Roman" w:hAnsi="Times New Roman"/>
-          <w:b/>
-          <w:bCs/>
-          <w:sz w:val="28"/>
-          <w:szCs w:val="28"/>
-        </w:rPr>
-        <w:t xml:space="preserve"> </w:t>
-      </w:r>
-      <w:proofErr w:type="spellStart"/>
-      <w:r>
-        <w:rPr>
-          <w:rFonts w:ascii="Times New Roman" w:hAnsi="Times New Roman"/>
-          <w:b/>
-          <w:bCs/>
-          <w:sz w:val="28"/>
-          <w:szCs w:val="28"/>
-        </w:rPr>
-        <w:t>sinh</w:t>
-      </w:r>
-      <w:proofErr w:type="spellEnd"/>
-      <w:r>
-        <w:rPr>
-          <w:rFonts w:ascii="Times New Roman" w:hAnsi="Times New Roman"/>
-          <w:b/>
-          <w:bCs/>
-          <w:sz w:val="28"/>
-          <w:szCs w:val="28"/>
-        </w:rPr>
-        <w:t xml:space="preserve"> </w:t>
-      </w:r>
-      <w:proofErr w:type="spellStart"/>
-      <w:r>
-        <w:rPr>
-          <w:rFonts w:ascii="Times New Roman" w:hAnsi="Times New Roman"/>
-          <w:b/>
-          <w:bCs/>
-          <w:sz w:val="28"/>
-          <w:szCs w:val="28"/>
-        </w:rPr>
-        <w:t>viên</w:t>
-      </w:r>
-      <w:proofErr w:type="spellEnd"/>
-      <w:r>
-        <w:rPr>
-          <w:rFonts w:ascii="Times New Roman" w:hAnsi="Times New Roman"/>
-          <w:b/>
-          <w:bCs/>
-          <w:sz w:val="28"/>
-          <w:szCs w:val="28"/>
-        </w:rPr>
-        <w:t xml:space="preserve"> </w:t>
-      </w:r>
-      <w:proofErr w:type="spellStart"/>
-      <w:r>
-        <w:rPr>
-          <w:rFonts w:ascii="Times New Roman" w:hAnsi="Times New Roman"/>
-          <w:b/>
-          <w:bCs/>
-          <w:sz w:val="28"/>
-          <w:szCs w:val="28"/>
-        </w:rPr>
-        <w:t>thực</w:t>
-      </w:r>
-      <w:proofErr w:type="spellEnd"/>
-      <w:r>
-        <w:rPr>
-          <w:rFonts w:ascii="Times New Roman" w:hAnsi="Times New Roman"/>
-          <w:b/>
-          <w:bCs/>
-          <w:sz w:val="28"/>
-          <w:szCs w:val="28"/>
-        </w:rPr>
-        <w:t xml:space="preserve"> </w:t>
-      </w:r>
-      <w:proofErr w:type="spellStart"/>
-      <w:r>
-        <w:rPr>
-          <w:rFonts w:ascii="Times New Roman" w:hAnsi="Times New Roman"/>
-          <w:b/>
-          <w:bCs/>
-          <w:sz w:val="28"/>
-          <w:szCs w:val="28"/>
-        </w:rPr>
-        <w:t>tập</w:t>
-      </w:r>
-      <w:proofErr w:type="spellEnd"/>
-      <w:r>
-        <w:rPr>
-          <w:rFonts w:ascii="Times New Roman" w:hAnsi="Times New Roman"/>
-          <w:b/>
-          <w:bCs/>
-          <w:sz w:val="28"/>
-          <w:szCs w:val="28"/>
-        </w:rPr>
-        <w:t>:</w:t>
+        <w:t>Số lượng sinh viên thực tập:</w:t>
       </w:r>
     </w:p>
     <w:p>
@@ -824,16 +503,14 @@
           <w:szCs w:val="28"/>
         </w:rPr>
       </w:pPr>
-      <w:proofErr w:type="spellStart"/>
       <w:r>
         <w:rPr>
           <w:rFonts w:ascii="Times New Roman" w:hAnsi="Times New Roman"/>
           <w:sz w:val="28"/>
           <w:szCs w:val="28"/>
         </w:rPr>
-        <w:t>Số</w:t>
-      </w:r>
-      <w:proofErr w:type="spellEnd"/>
+        <w:t>Số lượng doanh nghiệp nhận sinh viên thực tập:</w:t>
+      </w:r>
       <w:r>
         <w:rPr>
           <w:rFonts w:ascii="Times New Roman" w:hAnsi="Times New Roman"/>
@@ -842,202 +519,22 @@
         </w:rPr>
         <w:t xml:space="preserve"> </w:t>
       </w:r>
-      <w:proofErr w:type="spellStart"/>
       <w:r>
         <w:rPr>
           <w:rFonts w:ascii="Times New Roman" w:hAnsi="Times New Roman"/>
           <w:sz w:val="28"/>
           <w:szCs w:val="28"/>
         </w:rPr>
-        <w:t>lượng</w:t>
-      </w:r>
-      <w:proofErr w:type="spellEnd"/>
+        <w:t>{SO_DOANH_NGHIEP}</w:t>
+      </w:r>
       <w:r>
         <w:rPr>
           <w:rFonts w:ascii="Times New Roman" w:hAnsi="Times New Roman"/>
           <w:sz w:val="28"/>
           <w:szCs w:val="28"/>
         </w:rPr>
-        <w:t xml:space="preserve"> </w:t>
-      </w:r>
-      <w:proofErr w:type="spellStart"/>
-      <w:r>
-        <w:rPr>
-          <w:rFonts w:ascii="Times New Roman" w:hAnsi="Times New Roman"/>
-          <w:sz w:val="28"/>
-          <w:szCs w:val="28"/>
-        </w:rPr>
-        <w:t>doanh</w:t>
-      </w:r>
-      <w:proofErr w:type="spellEnd"/>
-      <w:r>
-        <w:rPr>
-          <w:rFonts w:ascii="Times New Roman" w:hAnsi="Times New Roman"/>
-          <w:sz w:val="28"/>
-          <w:szCs w:val="28"/>
-        </w:rPr>
-        <w:t xml:space="preserve"> </w:t>
-      </w:r>
-      <w:proofErr w:type="spellStart"/>
-      <w:r>
-        <w:rPr>
-          <w:rFonts w:ascii="Times New Roman" w:hAnsi="Times New Roman"/>
-          <w:sz w:val="28"/>
-          <w:szCs w:val="28"/>
-        </w:rPr>
-        <w:t>nghiệp</w:t>
-      </w:r>
-      <w:proofErr w:type="spellEnd"/>
-      <w:r>
-        <w:rPr>
-          <w:rFonts w:ascii="Times New Roman" w:hAnsi="Times New Roman"/>
-          <w:sz w:val="28"/>
-          <w:szCs w:val="28"/>
-        </w:rPr>
-        <w:t xml:space="preserve"> </w:t>
-      </w:r>
-      <w:proofErr w:type="spellStart"/>
-      <w:r>
-        <w:rPr>
-          <w:rFonts w:ascii="Times New Roman" w:hAnsi="Times New Roman"/>
-          <w:sz w:val="28"/>
-          <w:szCs w:val="28"/>
-        </w:rPr>
-        <w:t>nhận</w:t>
-      </w:r>
-      <w:proofErr w:type="spellEnd"/>
-      <w:r>
-        <w:rPr>
-          <w:rFonts w:ascii="Times New Roman" w:hAnsi="Times New Roman"/>
-          <w:sz w:val="28"/>
-          <w:szCs w:val="28"/>
-        </w:rPr>
-        <w:t xml:space="preserve"> </w:t>
-      </w:r>
-      <w:proofErr w:type="spellStart"/>
-      <w:r>
-        <w:rPr>
-          <w:rFonts w:ascii="Times New Roman" w:hAnsi="Times New Roman"/>
-          <w:sz w:val="28"/>
-          <w:szCs w:val="28"/>
-        </w:rPr>
-        <w:t>sinh</w:t>
-      </w:r>
-      <w:proofErr w:type="spellEnd"/>
-      <w:r>
-        <w:rPr>
-          <w:rFonts w:ascii="Times New Roman" w:hAnsi="Times New Roman"/>
-          <w:sz w:val="28"/>
-          <w:szCs w:val="28"/>
-        </w:rPr>
-        <w:t xml:space="preserve"> </w:t>
-      </w:r>
-      <w:proofErr w:type="spellStart"/>
-      <w:r>
-        <w:rPr>
-          <w:rFonts w:ascii="Times New Roman" w:hAnsi="Times New Roman"/>
-          <w:sz w:val="28"/>
-          <w:szCs w:val="28"/>
-        </w:rPr>
-        <w:t>viên</w:t>
-      </w:r>
-      <w:proofErr w:type="spellEnd"/>
-      <w:r>
-        <w:rPr>
-          <w:rFonts w:ascii="Times New Roman" w:hAnsi="Times New Roman"/>
-          <w:sz w:val="28"/>
-          <w:szCs w:val="28"/>
-        </w:rPr>
-        <w:t xml:space="preserve"> </w:t>
-      </w:r>
-      <w:proofErr w:type="spellStart"/>
-      <w:r>
-        <w:rPr>
-          <w:rFonts w:ascii="Times New Roman" w:hAnsi="Times New Roman"/>
-          <w:sz w:val="28"/>
-          <w:szCs w:val="28"/>
-        </w:rPr>
-        <w:t>thực</w:t>
-      </w:r>
-      <w:proofErr w:type="spellEnd"/>
-      <w:r>
-        <w:rPr>
-          <w:rFonts w:ascii="Times New Roman" w:hAnsi="Times New Roman"/>
-          <w:sz w:val="28"/>
-          <w:szCs w:val="28"/>
-        </w:rPr>
-        <w:t xml:space="preserve"> </w:t>
-      </w:r>
-      <w:proofErr w:type="spellStart"/>
-      <w:r>
-        <w:rPr>
-          <w:rFonts w:ascii="Times New Roman" w:hAnsi="Times New Roman"/>
-          <w:sz w:val="28"/>
-          <w:szCs w:val="28"/>
-        </w:rPr>
-        <w:t>tập</w:t>
-      </w:r>
-      <w:proofErr w:type="spellEnd"/>
-      <w:r>
-        <w:rPr>
-          <w:rFonts w:ascii="Times New Roman" w:hAnsi="Times New Roman"/>
-          <w:sz w:val="28"/>
-          <w:szCs w:val="28"/>
-        </w:rPr>
-        <w:t>:</w:t>
-      </w:r>
-      <w:r>
-        <w:rPr>
-          <w:rFonts w:ascii="Times New Roman" w:hAnsi="Times New Roman"/>
-          <w:sz w:val="28"/>
-          <w:szCs w:val="28"/>
-        </w:rPr>
-        <w:t xml:space="preserve"> </w:t>
-      </w:r>
-      <w:r>
-        <w:rPr>
-          <w:rFonts w:ascii="Times New Roman" w:hAnsi="Times New Roman"/>
-          <w:sz w:val="28"/>
-          <w:szCs w:val="28"/>
-        </w:rPr>
-        <w:t>{SO_DOANH_NGHIEP}</w:t>
-      </w:r>
-      <w:r>
-        <w:rPr>
-          <w:rFonts w:ascii="Times New Roman" w:hAnsi="Times New Roman"/>
-          <w:sz w:val="28"/>
-          <w:szCs w:val="28"/>
-        </w:rPr>
-        <w:t xml:space="preserve"> </w:t>
-      </w:r>
-      <w:proofErr w:type="spellStart"/>
-      <w:r>
-        <w:rPr>
-          <w:rFonts w:ascii="Times New Roman" w:hAnsi="Times New Roman"/>
-          <w:sz w:val="28"/>
-          <w:szCs w:val="28"/>
-        </w:rPr>
-        <w:t>đơn</w:t>
-      </w:r>
-      <w:proofErr w:type="spellEnd"/>
-      <w:r>
-        <w:rPr>
-          <w:rFonts w:ascii="Times New Roman" w:hAnsi="Times New Roman"/>
-          <w:sz w:val="28"/>
-          <w:szCs w:val="28"/>
-        </w:rPr>
-        <w:t xml:space="preserve"> </w:t>
-      </w:r>
-      <w:proofErr w:type="spellStart"/>
-      <w:r>
-        <w:rPr>
-          <w:rFonts w:ascii="Times New Roman" w:hAnsi="Times New Roman"/>
-          <w:sz w:val="28"/>
-          <w:szCs w:val="28"/>
-        </w:rPr>
-        <w:t>vị</w:t>
-      </w:r>
-      <w:proofErr w:type="spellEnd"/>
+        <w:t xml:space="preserve"> đơn vị</w:t>
+      </w:r>
     </w:p>
     <w:p>
       <w:pPr>
@@ -1055,7 +552,6 @@
           <w:szCs w:val="28"/>
         </w:rPr>
       </w:pPr>
-      <w:proofErr w:type="spellStart"/>
       <w:proofErr w:type="gramStart"/>
       <w:r>
         <w:rPr>
@@ -1063,9 +559,8 @@
           <w:sz w:val="28"/>
           <w:szCs w:val="28"/>
         </w:rPr>
-        <w:t>Số</w:t>
-      </w:r>
-      <w:proofErr w:type="spellEnd"/>
+        <w:t>Số lượng sinh viên đăng ký thực tập:</w:t>
+      </w:r>
       <w:r>
         <w:rPr>
           <w:rFonts w:ascii="Times New Roman" w:hAnsi="Times New Roman"/>
@@ -1074,193 +569,31 @@
         </w:rPr>
         <w:t xml:space="preserve"> </w:t>
       </w:r>
-      <w:proofErr w:type="spellStart"/>
       <w:r>
         <w:rPr>
           <w:rFonts w:ascii="Times New Roman" w:hAnsi="Times New Roman"/>
           <w:sz w:val="28"/>
           <w:szCs w:val="28"/>
         </w:rPr>
-        <w:t>lượng</w:t>
-      </w:r>
-      <w:proofErr w:type="spellEnd"/>
+        <w:t>{</w:t>
+      </w:r>
+      <w:proofErr w:type="gramEnd"/>
       <w:r>
         <w:rPr>
           <w:rFonts w:ascii="Times New Roman" w:hAnsi="Times New Roman"/>
           <w:sz w:val="28"/>
           <w:szCs w:val="28"/>
         </w:rPr>
-        <w:t xml:space="preserve"> </w:t>
-      </w:r>
-      <w:proofErr w:type="spellStart"/>
+        <w:t>SO_SV_DANG_KY}</w:t>
+      </w:r>
       <w:r>
         <w:rPr>
           <w:rFonts w:ascii="Times New Roman" w:hAnsi="Times New Roman"/>
           <w:sz w:val="28"/>
           <w:szCs w:val="28"/>
         </w:rPr>
-        <w:t>sinh</w:t>
-      </w:r>
-      <w:proofErr w:type="spellEnd"/>
-      <w:r>
-        <w:rPr>
-          <w:rFonts w:ascii="Times New Roman" w:hAnsi="Times New Roman"/>
-          <w:sz w:val="28"/>
-          <w:szCs w:val="28"/>
-        </w:rPr>
-        <w:t xml:space="preserve"> </w:t>
-      </w:r>
-      <w:proofErr w:type="spellStart"/>
-      <w:r>
-        <w:rPr>
-          <w:rFonts w:ascii="Times New Roman" w:hAnsi="Times New Roman"/>
-          <w:sz w:val="28"/>
-          <w:szCs w:val="28"/>
-        </w:rPr>
-        <w:t>viên</w:t>
-      </w:r>
-      <w:proofErr w:type="spellEnd"/>
-      <w:r>
-        <w:rPr>
-          <w:rFonts w:ascii="Times New Roman" w:hAnsi="Times New Roman"/>
-          <w:sz w:val="28"/>
-          <w:szCs w:val="28"/>
-        </w:rPr>
-        <w:t xml:space="preserve"> </w:t>
-      </w:r>
-      <w:proofErr w:type="spellStart"/>
-      <w:r>
-        <w:rPr>
-          <w:rFonts w:ascii="Times New Roman" w:hAnsi="Times New Roman"/>
-          <w:sz w:val="28"/>
-          <w:szCs w:val="28"/>
-        </w:rPr>
-        <w:t>đăng</w:t>
-      </w:r>
-      <w:proofErr w:type="spellEnd"/>
-      <w:r>
-        <w:rPr>
-          <w:rFonts w:ascii="Times New Roman" w:hAnsi="Times New Roman"/>
-          <w:sz w:val="28"/>
-          <w:szCs w:val="28"/>
-        </w:rPr>
-        <w:t xml:space="preserve"> </w:t>
-      </w:r>
-      <w:proofErr w:type="spellStart"/>
-      <w:r>
-        <w:rPr>
-          <w:rFonts w:ascii="Times New Roman" w:hAnsi="Times New Roman"/>
-          <w:sz w:val="28"/>
-          <w:szCs w:val="28"/>
-        </w:rPr>
-        <w:t>ký</w:t>
-      </w:r>
-      <w:proofErr w:type="spellEnd"/>
-      <w:r>
-        <w:rPr>
-          <w:rFonts w:ascii="Times New Roman" w:hAnsi="Times New Roman"/>
-          <w:sz w:val="28"/>
-          <w:szCs w:val="28"/>
-        </w:rPr>
-        <w:t xml:space="preserve"> </w:t>
-      </w:r>
-      <w:proofErr w:type="spellStart"/>
-      <w:r>
-        <w:rPr>
-          <w:rFonts w:ascii="Times New Roman" w:hAnsi="Times New Roman"/>
-          <w:sz w:val="28"/>
-          <w:szCs w:val="28"/>
-        </w:rPr>
-        <w:t>thực</w:t>
-      </w:r>
-      <w:proofErr w:type="spellEnd"/>
-      <w:r>
-        <w:rPr>
-          <w:rFonts w:ascii="Times New Roman" w:hAnsi="Times New Roman"/>
-          <w:sz w:val="28"/>
-          <w:szCs w:val="28"/>
-        </w:rPr>
-        <w:t xml:space="preserve"> </w:t>
-      </w:r>
-      <w:proofErr w:type="spellStart"/>
-      <w:r>
-        <w:rPr>
-          <w:rFonts w:ascii="Times New Roman" w:hAnsi="Times New Roman"/>
-          <w:sz w:val="28"/>
-          <w:szCs w:val="28"/>
-        </w:rPr>
-        <w:t>tập</w:t>
-      </w:r>
-      <w:proofErr w:type="spellEnd"/>
-      <w:r>
-        <w:rPr>
-          <w:rFonts w:ascii="Times New Roman" w:hAnsi="Times New Roman"/>
-          <w:sz w:val="28"/>
-          <w:szCs w:val="28"/>
-        </w:rPr>
-        <w:t>:</w:t>
-      </w:r>
-      <w:r>
-        <w:rPr>
-          <w:rFonts w:ascii="Times New Roman" w:hAnsi="Times New Roman"/>
-          <w:sz w:val="28"/>
-          <w:szCs w:val="28"/>
-        </w:rPr>
-        <w:t xml:space="preserve"> </w:t>
-      </w:r>
-      <w:r>
-        <w:rPr>
-          <w:rFonts w:ascii="Times New Roman" w:hAnsi="Times New Roman"/>
-          <w:sz w:val="28"/>
-          <w:szCs w:val="28"/>
-        </w:rPr>
-        <w:t>{</w:t>
-      </w:r>
-      <w:proofErr w:type="gramEnd"/>
-      <w:r>
-        <w:rPr>
-          <w:rFonts w:ascii="Times New Roman" w:hAnsi="Times New Roman"/>
-          <w:sz w:val="28"/>
-          <w:szCs w:val="28"/>
-        </w:rPr>
-        <w:t>SO_SV_DANG_KY}</w:t>
-      </w:r>
-      <w:r>
-        <w:rPr>
-          <w:rFonts w:ascii="Times New Roman" w:hAnsi="Times New Roman"/>
-          <w:sz w:val="28"/>
-          <w:szCs w:val="28"/>
-        </w:rPr>
-        <w:t xml:space="preserve"> </w:t>
-      </w:r>
-      <w:proofErr w:type="spellStart"/>
-      <w:r>
-        <w:rPr>
-          <w:rFonts w:ascii="Times New Roman" w:hAnsi="Times New Roman"/>
-          <w:sz w:val="28"/>
-          <w:szCs w:val="28"/>
-        </w:rPr>
-        <w:t>sinh</w:t>
-      </w:r>
-      <w:proofErr w:type="spellEnd"/>
-      <w:r>
-        <w:rPr>
-          <w:rFonts w:ascii="Times New Roman" w:hAnsi="Times New Roman"/>
-          <w:sz w:val="28"/>
-          <w:szCs w:val="28"/>
-        </w:rPr>
-        <w:t xml:space="preserve"> </w:t>
-      </w:r>
-      <w:proofErr w:type="spellStart"/>
-      <w:r>
-        <w:rPr>
-          <w:rFonts w:ascii="Times New Roman" w:hAnsi="Times New Roman"/>
-          <w:sz w:val="28"/>
-          <w:szCs w:val="28"/>
-        </w:rPr>
-        <w:t>viên</w:t>
-      </w:r>
-      <w:proofErr w:type="spellEnd"/>
+        <w:t xml:space="preserve"> sinh viên</w:t>
+      </w:r>
     </w:p>
     <w:p>
       <w:pPr>
@@ -1278,16 +611,14 @@
           <w:szCs w:val="28"/>
         </w:rPr>
       </w:pPr>
-      <w:proofErr w:type="spellStart"/>
       <w:r>
         <w:rPr>
           <w:rFonts w:ascii="Times New Roman" w:hAnsi="Times New Roman"/>
           <w:sz w:val="28"/>
           <w:szCs w:val="28"/>
         </w:rPr>
-        <w:t>Số</w:t>
-      </w:r>
-      <w:proofErr w:type="spellEnd"/>
+        <w:t>Số lượng sinh viên hoàn thành đợt thực tập:</w:t>
+      </w:r>
       <w:r>
         <w:rPr>
           <w:rFonts w:ascii="Times New Roman" w:hAnsi="Times New Roman"/>
@@ -1296,202 +627,22 @@
         </w:rPr>
         <w:t xml:space="preserve"> </w:t>
       </w:r>
-      <w:proofErr w:type="spellStart"/>
       <w:r>
         <w:rPr>
           <w:rFonts w:ascii="Times New Roman" w:hAnsi="Times New Roman"/>
           <w:sz w:val="28"/>
           <w:szCs w:val="28"/>
         </w:rPr>
-        <w:t>lượng</w:t>
-      </w:r>
-      <w:proofErr w:type="spellEnd"/>
+        <w:t>{SO_SV_HOAN_THANH}</w:t>
+      </w:r>
       <w:r>
         <w:rPr>
           <w:rFonts w:ascii="Times New Roman" w:hAnsi="Times New Roman"/>
           <w:sz w:val="28"/>
           <w:szCs w:val="28"/>
         </w:rPr>
-        <w:t xml:space="preserve"> </w:t>
-      </w:r>
-      <w:proofErr w:type="spellStart"/>
-      <w:r>
-        <w:rPr>
-          <w:rFonts w:ascii="Times New Roman" w:hAnsi="Times New Roman"/>
-          <w:sz w:val="28"/>
-          <w:szCs w:val="28"/>
-        </w:rPr>
-        <w:t>sinh</w:t>
-      </w:r>
-      <w:proofErr w:type="spellEnd"/>
-      <w:r>
-        <w:rPr>
-          <w:rFonts w:ascii="Times New Roman" w:hAnsi="Times New Roman"/>
-          <w:sz w:val="28"/>
-          <w:szCs w:val="28"/>
-        </w:rPr>
-        <w:t xml:space="preserve"> </w:t>
-      </w:r>
-      <w:proofErr w:type="spellStart"/>
-      <w:r>
-        <w:rPr>
-          <w:rFonts w:ascii="Times New Roman" w:hAnsi="Times New Roman"/>
-          <w:sz w:val="28"/>
-          <w:szCs w:val="28"/>
-        </w:rPr>
-        <w:t>viên</w:t>
-      </w:r>
-      <w:proofErr w:type="spellEnd"/>
-      <w:r>
-        <w:rPr>
-          <w:rFonts w:ascii="Times New Roman" w:hAnsi="Times New Roman"/>
-          <w:sz w:val="28"/>
-          <w:szCs w:val="28"/>
-        </w:rPr>
-        <w:t xml:space="preserve"> </w:t>
-      </w:r>
-      <w:proofErr w:type="spellStart"/>
-      <w:r>
-        <w:rPr>
-          <w:rFonts w:ascii="Times New Roman" w:hAnsi="Times New Roman"/>
-          <w:sz w:val="28"/>
-          <w:szCs w:val="28"/>
-        </w:rPr>
-        <w:t>hoàn</w:t>
-      </w:r>
-      <w:proofErr w:type="spellEnd"/>
-      <w:r>
-        <w:rPr>
-          <w:rFonts w:ascii="Times New Roman" w:hAnsi="Times New Roman"/>
-          <w:sz w:val="28"/>
-          <w:szCs w:val="28"/>
-        </w:rPr>
-        <w:t xml:space="preserve"> </w:t>
-      </w:r>
-      <w:proofErr w:type="spellStart"/>
-      <w:r>
-        <w:rPr>
-          <w:rFonts w:ascii="Times New Roman" w:hAnsi="Times New Roman"/>
-          <w:sz w:val="28"/>
-          <w:szCs w:val="28"/>
-        </w:rPr>
-        <w:t>thành</w:t>
-      </w:r>
-      <w:proofErr w:type="spellEnd"/>
-      <w:r>
-        <w:rPr>
-          <w:rFonts w:ascii="Times New Roman" w:hAnsi="Times New Roman"/>
-          <w:sz w:val="28"/>
-          <w:szCs w:val="28"/>
-        </w:rPr>
-        <w:t xml:space="preserve"> </w:t>
-      </w:r>
-      <w:proofErr w:type="spellStart"/>
-      <w:r>
-        <w:rPr>
-          <w:rFonts w:ascii="Times New Roman" w:hAnsi="Times New Roman"/>
-          <w:sz w:val="28"/>
-          <w:szCs w:val="28"/>
-        </w:rPr>
-        <w:t>đợt</w:t>
-      </w:r>
-      <w:proofErr w:type="spellEnd"/>
-      <w:r>
-        <w:rPr>
-          <w:rFonts w:ascii="Times New Roman" w:hAnsi="Times New Roman"/>
-          <w:sz w:val="28"/>
-          <w:szCs w:val="28"/>
-        </w:rPr>
-        <w:t xml:space="preserve"> </w:t>
-      </w:r>
-      <w:proofErr w:type="spellStart"/>
-      <w:r>
-        <w:rPr>
-          <w:rFonts w:ascii="Times New Roman" w:hAnsi="Times New Roman"/>
-          <w:sz w:val="28"/>
-          <w:szCs w:val="28"/>
-        </w:rPr>
-        <w:t>thực</w:t>
-      </w:r>
-      <w:proofErr w:type="spellEnd"/>
-      <w:r>
-        <w:rPr>
-          <w:rFonts w:ascii="Times New Roman" w:hAnsi="Times New Roman"/>
-          <w:sz w:val="28"/>
-          <w:szCs w:val="28"/>
-        </w:rPr>
-        <w:t xml:space="preserve"> </w:t>
-      </w:r>
-      <w:proofErr w:type="spellStart"/>
-      <w:r>
-        <w:rPr>
-          <w:rFonts w:ascii="Times New Roman" w:hAnsi="Times New Roman"/>
-          <w:sz w:val="28"/>
-          <w:szCs w:val="28"/>
-        </w:rPr>
-        <w:t>tập</w:t>
-      </w:r>
-      <w:proofErr w:type="spellEnd"/>
-      <w:r>
-        <w:rPr>
-          <w:rFonts w:ascii="Times New Roman" w:hAnsi="Times New Roman"/>
-          <w:sz w:val="28"/>
-          <w:szCs w:val="28"/>
-        </w:rPr>
-        <w:t>:</w:t>
-      </w:r>
-      <w:r>
-        <w:rPr>
-          <w:rFonts w:ascii="Times New Roman" w:hAnsi="Times New Roman"/>
-          <w:sz w:val="28"/>
-          <w:szCs w:val="28"/>
-        </w:rPr>
-        <w:t xml:space="preserve"> </w:t>
-      </w:r>
-      <w:r>
-        <w:rPr>
-          <w:rFonts w:ascii="Times New Roman" w:hAnsi="Times New Roman"/>
-          <w:sz w:val="28"/>
-          <w:szCs w:val="28"/>
-        </w:rPr>
-        <w:t>{SO_SV_HOAN_THANH}</w:t>
-      </w:r>
-      <w:r>
-        <w:rPr>
-          <w:rFonts w:ascii="Times New Roman" w:hAnsi="Times New Roman"/>
-          <w:sz w:val="28"/>
-          <w:szCs w:val="28"/>
-        </w:rPr>
-        <w:t xml:space="preserve"> </w:t>
-      </w:r>
-      <w:proofErr w:type="spellStart"/>
-      <w:r>
-        <w:rPr>
-          <w:rFonts w:ascii="Times New Roman" w:hAnsi="Times New Roman"/>
-          <w:sz w:val="28"/>
-          <w:szCs w:val="28"/>
-        </w:rPr>
-        <w:t>sinh</w:t>
-      </w:r>
-      <w:proofErr w:type="spellEnd"/>
-      <w:r>
-        <w:rPr>
-          <w:rFonts w:ascii="Times New Roman" w:hAnsi="Times New Roman"/>
-          <w:sz w:val="28"/>
-          <w:szCs w:val="28"/>
-        </w:rPr>
-        <w:t xml:space="preserve"> </w:t>
-      </w:r>
-      <w:proofErr w:type="spellStart"/>
-      <w:r>
-        <w:rPr>
-          <w:rFonts w:ascii="Times New Roman" w:hAnsi="Times New Roman"/>
-          <w:sz w:val="28"/>
-          <w:szCs w:val="28"/>
-        </w:rPr>
-        <w:t>viên</w:t>
-      </w:r>
-      <w:proofErr w:type="spellEnd"/>
+        <w:t xml:space="preserve"> sinh viên</w:t>
+      </w:r>
     </w:p>
     <w:p>
       <w:pPr>
@@ -1509,7 +660,6 @@
           <w:szCs w:val="28"/>
         </w:rPr>
       </w:pPr>
-      <w:proofErr w:type="spellStart"/>
       <w:r>
         <w:rPr>
           <w:rFonts w:ascii="Times New Roman" w:hAnsi="Times New Roman"/>
@@ -1518,193 +668,38 @@
         </w:rPr>
         <w:t>Số</w:t>
       </w:r>
-      <w:proofErr w:type="spellEnd"/>
       <w:r>
         <w:rPr>
           <w:rFonts w:ascii="Times New Roman" w:hAnsi="Times New Roman"/>
           <w:sz w:val="28"/>
           <w:szCs w:val="28"/>
         </w:rPr>
-        <w:t xml:space="preserve"> </w:t>
-      </w:r>
-      <w:proofErr w:type="spellStart"/>
+        <w:t xml:space="preserve"> sinh viên không hoàn thành thực tập:</w:t>
+      </w:r>
       <w:r>
         <w:rPr>
           <w:rFonts w:ascii="Times New Roman" w:hAnsi="Times New Roman"/>
           <w:sz w:val="28"/>
           <w:szCs w:val="28"/>
         </w:rPr>
-        <w:t>sinh</w:t>
-      </w:r>
-      <w:proofErr w:type="spellEnd"/>
+        <w:t xml:space="preserve"> </w:t>
+      </w:r>
       <w:r>
         <w:rPr>
           <w:rFonts w:ascii="Times New Roman" w:hAnsi="Times New Roman"/>
           <w:sz w:val="28"/>
           <w:szCs w:val="28"/>
         </w:rPr>
-        <w:t xml:space="preserve"> </w:t>
-      </w:r>
-      <w:proofErr w:type="spellStart"/>
+        <w:t>{SO_SV_KHONG_HOAN_THANH}</w:t>
+      </w:r>
       <w:r>
         <w:rPr>
           <w:rFonts w:ascii="Times New Roman" w:hAnsi="Times New Roman"/>
           <w:sz w:val="28"/>
           <w:szCs w:val="28"/>
         </w:rPr>
-        <w:t>viên</w:t>
-      </w:r>
-      <w:proofErr w:type="spellEnd"/>
-      <w:r>
-        <w:rPr>
-          <w:rFonts w:ascii="Times New Roman" w:hAnsi="Times New Roman"/>
-          <w:sz w:val="28"/>
-          <w:szCs w:val="28"/>
-        </w:rPr>
-        <w:t xml:space="preserve"> </w:t>
-      </w:r>
-      <w:proofErr w:type="spellStart"/>
-      <w:r>
-        <w:rPr>
-          <w:rFonts w:ascii="Times New Roman" w:hAnsi="Times New Roman"/>
-          <w:sz w:val="28"/>
-          <w:szCs w:val="28"/>
-        </w:rPr>
-        <w:t>không</w:t>
-      </w:r>
-      <w:proofErr w:type="spellEnd"/>
-      <w:r>
-        <w:rPr>
-          <w:rFonts w:ascii="Times New Roman" w:hAnsi="Times New Roman"/>
-          <w:sz w:val="28"/>
-          <w:szCs w:val="28"/>
-        </w:rPr>
-        <w:t xml:space="preserve"> </w:t>
-      </w:r>
-      <w:proofErr w:type="spellStart"/>
-      <w:r>
-        <w:rPr>
-          <w:rFonts w:ascii="Times New Roman" w:hAnsi="Times New Roman"/>
-          <w:sz w:val="28"/>
-          <w:szCs w:val="28"/>
-        </w:rPr>
-        <w:t>hoàn</w:t>
-      </w:r>
-      <w:proofErr w:type="spellEnd"/>
-      <w:r>
-        <w:rPr>
-          <w:rFonts w:ascii="Times New Roman" w:hAnsi="Times New Roman"/>
-          <w:sz w:val="28"/>
-          <w:szCs w:val="28"/>
-        </w:rPr>
-        <w:t xml:space="preserve"> </w:t>
-      </w:r>
-      <w:proofErr w:type="spellStart"/>
-      <w:r>
-        <w:rPr>
-          <w:rFonts w:ascii="Times New Roman" w:hAnsi="Times New Roman"/>
-          <w:sz w:val="28"/>
-          <w:szCs w:val="28"/>
-        </w:rPr>
-        <w:t>thành</w:t>
-      </w:r>
-      <w:proofErr w:type="spellEnd"/>
-      <w:r>
-        <w:rPr>
-          <w:rFonts w:ascii="Times New Roman" w:hAnsi="Times New Roman"/>
-          <w:sz w:val="28"/>
-          <w:szCs w:val="28"/>
-        </w:rPr>
-        <w:t xml:space="preserve"> </w:t>
-      </w:r>
-      <w:proofErr w:type="spellStart"/>
-      <w:r>
-        <w:rPr>
-          <w:rFonts w:ascii="Times New Roman" w:hAnsi="Times New Roman"/>
-          <w:sz w:val="28"/>
-          <w:szCs w:val="28"/>
-        </w:rPr>
-        <w:t>thực</w:t>
-      </w:r>
-      <w:proofErr w:type="spellEnd"/>
-      <w:r>
-        <w:rPr>
-          <w:rFonts w:ascii="Times New Roman" w:hAnsi="Times New Roman"/>
-          <w:sz w:val="28"/>
-          <w:szCs w:val="28"/>
-        </w:rPr>
-        <w:t xml:space="preserve"> </w:t>
-      </w:r>
-      <w:proofErr w:type="spellStart"/>
-      <w:r>
-        <w:rPr>
-          <w:rFonts w:ascii="Times New Roman" w:hAnsi="Times New Roman"/>
-          <w:sz w:val="28"/>
-          <w:szCs w:val="28"/>
-        </w:rPr>
-        <w:t>tập</w:t>
-      </w:r>
-      <w:proofErr w:type="spellEnd"/>
-      <w:r>
-        <w:rPr>
-          <w:rFonts w:ascii="Times New Roman" w:hAnsi="Times New Roman"/>
-          <w:sz w:val="28"/>
-          <w:szCs w:val="28"/>
-        </w:rPr>
-        <w:t>:</w:t>
-      </w:r>
-      <w:r>
-        <w:rPr>
-          <w:rFonts w:ascii="Times New Roman" w:hAnsi="Times New Roman"/>
-          <w:sz w:val="28"/>
-          <w:szCs w:val="28"/>
-        </w:rPr>
-        <w:t xml:space="preserve"> </w:t>
-      </w:r>
-      <w:r>
-        <w:rPr>
-          <w:rFonts w:ascii="Times New Roman" w:hAnsi="Times New Roman"/>
-          <w:sz w:val="28"/>
-          <w:szCs w:val="28"/>
-        </w:rPr>
-        <w:t>{SO_SV_KHONG_HOAN_THANH}</w:t>
-      </w:r>
-      <w:r>
-        <w:rPr>
-          <w:rFonts w:ascii="Times New Roman" w:hAnsi="Times New Roman"/>
-          <w:sz w:val="28"/>
-          <w:szCs w:val="28"/>
-        </w:rPr>
-        <w:t xml:space="preserve"> </w:t>
-      </w:r>
-      <w:proofErr w:type="spellStart"/>
-      <w:r>
-        <w:rPr>
-          <w:rFonts w:ascii="Times New Roman" w:hAnsi="Times New Roman"/>
-          <w:sz w:val="28"/>
-          <w:szCs w:val="28"/>
-        </w:rPr>
-        <w:t>sinh</w:t>
-      </w:r>
-      <w:proofErr w:type="spellEnd"/>
-      <w:r>
-        <w:rPr>
-          <w:rFonts w:ascii="Times New Roman" w:hAnsi="Times New Roman"/>
-          <w:sz w:val="28"/>
-          <w:szCs w:val="28"/>
-        </w:rPr>
-        <w:t xml:space="preserve"> </w:t>
-      </w:r>
-      <w:proofErr w:type="spellStart"/>
-      <w:r>
-        <w:rPr>
-          <w:rFonts w:ascii="Times New Roman" w:hAnsi="Times New Roman"/>
-          <w:sz w:val="28"/>
-          <w:szCs w:val="28"/>
-        </w:rPr>
-        <w:t>viên</w:t>
-      </w:r>
-      <w:proofErr w:type="spellEnd"/>
+        <w:t xml:space="preserve"> sinh viên</w:t>
+      </w:r>
     </w:p>
     <w:p>
       <w:pPr>
@@ -1723,7 +718,6 @@
           <w:szCs w:val="28"/>
         </w:rPr>
       </w:pPr>
-      <w:proofErr w:type="spellStart"/>
       <w:r>
         <w:rPr>
           <w:rFonts w:ascii="Times New Roman" w:hAnsi="Times New Roman"/>
@@ -1732,119 +726,8 @@
           <w:sz w:val="28"/>
           <w:szCs w:val="28"/>
         </w:rPr>
-        <w:t>Thống</w:t>
-      </w:r>
-      <w:proofErr w:type="spellEnd"/>
-      <w:r>
-        <w:rPr>
-          <w:rFonts w:ascii="Times New Roman" w:hAnsi="Times New Roman"/>
-          <w:b/>
-          <w:bCs/>
-          <w:sz w:val="28"/>
-          <w:szCs w:val="28"/>
-        </w:rPr>
-        <w:t xml:space="preserve"> </w:t>
-      </w:r>
-      <w:proofErr w:type="spellStart"/>
-      <w:r>
-        <w:rPr>
-          <w:rFonts w:ascii="Times New Roman" w:hAnsi="Times New Roman"/>
-          <w:b/>
-          <w:bCs/>
-          <w:sz w:val="28"/>
-          <w:szCs w:val="28"/>
-        </w:rPr>
-        <w:t>kê</w:t>
-      </w:r>
-      <w:proofErr w:type="spellEnd"/>
-      <w:r>
-        <w:rPr>
-          <w:rFonts w:ascii="Times New Roman" w:hAnsi="Times New Roman"/>
-          <w:b/>
-          <w:bCs/>
-          <w:sz w:val="28"/>
-          <w:szCs w:val="28"/>
-        </w:rPr>
-        <w:t xml:space="preserve"> </w:t>
-      </w:r>
-      <w:proofErr w:type="spellStart"/>
-      <w:r>
-        <w:rPr>
-          <w:rFonts w:ascii="Times New Roman" w:hAnsi="Times New Roman"/>
-          <w:b/>
-          <w:bCs/>
-          <w:sz w:val="28"/>
-          <w:szCs w:val="28"/>
-        </w:rPr>
-        <w:t>kết</w:t>
-      </w:r>
-      <w:proofErr w:type="spellEnd"/>
-      <w:r>
-        <w:rPr>
-          <w:rFonts w:ascii="Times New Roman" w:hAnsi="Times New Roman"/>
-          <w:b/>
-          <w:bCs/>
-          <w:sz w:val="28"/>
-          <w:szCs w:val="28"/>
-        </w:rPr>
-        <w:t xml:space="preserve"> </w:t>
-      </w:r>
-      <w:proofErr w:type="spellStart"/>
-      <w:r>
-        <w:rPr>
-          <w:rFonts w:ascii="Times New Roman" w:hAnsi="Times New Roman"/>
-          <w:b/>
-          <w:bCs/>
-          <w:sz w:val="28"/>
-          <w:szCs w:val="28"/>
-        </w:rPr>
-        <w:t>quả</w:t>
-      </w:r>
-      <w:proofErr w:type="spellEnd"/>
-      <w:r>
-        <w:rPr>
-          <w:rFonts w:ascii="Times New Roman" w:hAnsi="Times New Roman"/>
-          <w:b/>
-          <w:bCs/>
-          <w:sz w:val="28"/>
-          <w:szCs w:val="28"/>
-        </w:rPr>
-        <w:t xml:space="preserve"> </w:t>
-      </w:r>
-      <w:proofErr w:type="spellStart"/>
-      <w:r>
-        <w:rPr>
-          <w:rFonts w:ascii="Times New Roman" w:hAnsi="Times New Roman"/>
-          <w:b/>
-          <w:bCs/>
-          <w:sz w:val="28"/>
-          <w:szCs w:val="28"/>
-        </w:rPr>
-        <w:t>thực</w:t>
-      </w:r>
-      <w:proofErr w:type="spellEnd"/>
-      <w:r>
-        <w:rPr>
-          <w:rFonts w:ascii="Times New Roman" w:hAnsi="Times New Roman"/>
-          <w:b/>
-          <w:bCs/>
-          <w:sz w:val="28"/>
-          <w:szCs w:val="28"/>
-        </w:rPr>
-        <w:t xml:space="preserve"> </w:t>
-      </w:r>
-      <w:proofErr w:type="spellStart"/>
-      <w:r>
-        <w:rPr>
-          <w:rFonts w:ascii="Times New Roman" w:hAnsi="Times New Roman"/>
-          <w:b/>
-          <w:bCs/>
-          <w:sz w:val="28"/>
-          <w:szCs w:val="28"/>
-        </w:rPr>
-        <w:t>tập</w:t>
-      </w:r>
-      <w:proofErr w:type="spellEnd"/>
+        <w:t>Thống kê kết quả thực tập</w:t>
+      </w:r>
       <w:r>
         <w:rPr>
           <w:rFonts w:ascii="Times New Roman" w:hAnsi="Times New Roman"/>
@@ -1986,22 +869,8 @@
                 <w:lang w:eastAsia="vi-VN"/>
                 <w14:ligatures w14:val="none"/>
               </w:rPr>
-              <w:t xml:space="preserve">ố </w:t>
-            </w:r>
-            <w:proofErr w:type="spellStart"/>
-            <w:r>
-              <w:rPr>
-                <w:rFonts w:eastAsia="Times New Roman" w:cs="Times New Roman"/>
-                <w:b/>
-                <w:bCs/>
-                <w:kern w:val="0"/>
-                <w:szCs w:val="28"/>
-                <w:lang w:eastAsia="vi-VN"/>
-                <w14:ligatures w14:val="none"/>
-              </w:rPr>
-              <w:t>lượng</w:t>
-            </w:r>
-            <w:proofErr w:type="spellEnd"/>
+              <w:t>ố lượng</w:t>
+            </w:r>
           </w:p>
         </w:tc>
         <w:tc>
@@ -2031,7 +900,6 @@
                 <w14:ligatures w14:val="none"/>
               </w:rPr>
             </w:pPr>
-            <w:proofErr w:type="spellStart"/>
             <w:r>
               <w:rPr>
                 <w:rFonts w:eastAsia="Times New Roman" w:cs="Times New Roman"/>
@@ -2042,35 +910,8 @@
                 <w:lang w:eastAsia="vi-VN"/>
                 <w14:ligatures w14:val="none"/>
               </w:rPr>
-              <w:t>Tỉ</w:t>
-            </w:r>
-            <w:proofErr w:type="spellEnd"/>
-            <w:r>
-              <w:rPr>
-                <w:rFonts w:eastAsia="Times New Roman" w:cs="Times New Roman"/>
-                <w:b/>
-                <w:bCs/>
-                <w:kern w:val="0"/>
-                <w:szCs w:val="28"/>
-                <w:lang w:eastAsia="vi-VN"/>
-                <w14:ligatures w14:val="none"/>
-              </w:rPr>
-              <w:t xml:space="preserve"> </w:t>
-            </w:r>
-            <w:proofErr w:type="spellStart"/>
-            <w:r>
-              <w:rPr>
-                <w:rFonts w:eastAsia="Times New Roman" w:cs="Times New Roman"/>
-                <w:b/>
-                <w:bCs/>
-                <w:kern w:val="0"/>
-                <w:szCs w:val="28"/>
-                <w:lang w:eastAsia="vi-VN"/>
-                <w14:ligatures w14:val="none"/>
-              </w:rPr>
-              <w:t>lệ</w:t>
-            </w:r>
-            <w:proofErr w:type="spellEnd"/>
+              <w:t>Tỉ lệ</w:t>
+            </w:r>
             <w:r>
               <w:rPr>
                 <w:rFonts w:eastAsia="Times New Roman" w:cs="Times New Roman"/>
@@ -2984,174 +1825,8 @@
           <w:sz w:val="28"/>
           <w:szCs w:val="28"/>
         </w:rPr>
-        <w:t xml:space="preserve">Danh </w:t>
-      </w:r>
-      <w:proofErr w:type="spellStart"/>
-      <w:r>
-        <w:rPr>
-          <w:rFonts w:ascii="Times New Roman" w:hAnsi="Times New Roman"/>
-          <w:b/>
-          <w:bCs/>
-          <w:sz w:val="28"/>
-          <w:szCs w:val="28"/>
-        </w:rPr>
-        <w:t>sách</w:t>
-      </w:r>
-      <w:proofErr w:type="spellEnd"/>
-      <w:r>
-        <w:rPr>
-          <w:rFonts w:ascii="Times New Roman" w:hAnsi="Times New Roman"/>
-          <w:b/>
-          <w:bCs/>
-          <w:sz w:val="28"/>
-          <w:szCs w:val="28"/>
-        </w:rPr>
-        <w:t xml:space="preserve"> </w:t>
-      </w:r>
-      <w:proofErr w:type="spellStart"/>
-      <w:r>
-        <w:rPr>
-          <w:rFonts w:ascii="Times New Roman" w:hAnsi="Times New Roman"/>
-          <w:b/>
-          <w:bCs/>
-          <w:sz w:val="28"/>
-          <w:szCs w:val="28"/>
-        </w:rPr>
-        <w:t>sinh</w:t>
-      </w:r>
-      <w:proofErr w:type="spellEnd"/>
-      <w:r>
-        <w:rPr>
-          <w:rFonts w:ascii="Times New Roman" w:hAnsi="Times New Roman"/>
-          <w:b/>
-          <w:bCs/>
-          <w:sz w:val="28"/>
-          <w:szCs w:val="28"/>
-        </w:rPr>
-        <w:t xml:space="preserve"> </w:t>
-      </w:r>
-      <w:proofErr w:type="spellStart"/>
-      <w:r>
-        <w:rPr>
-          <w:rFonts w:ascii="Times New Roman" w:hAnsi="Times New Roman"/>
-          <w:b/>
-          <w:bCs/>
-          <w:sz w:val="28"/>
-          <w:szCs w:val="28"/>
-        </w:rPr>
-        <w:t>viên</w:t>
-      </w:r>
-      <w:proofErr w:type="spellEnd"/>
-      <w:r>
-        <w:rPr>
-          <w:rFonts w:ascii="Times New Roman" w:hAnsi="Times New Roman"/>
-          <w:b/>
-          <w:bCs/>
-          <w:sz w:val="28"/>
-          <w:szCs w:val="28"/>
-        </w:rPr>
-        <w:t xml:space="preserve"> </w:t>
-      </w:r>
-      <w:proofErr w:type="spellStart"/>
-      <w:r>
-        <w:rPr>
-          <w:rFonts w:ascii="Times New Roman" w:hAnsi="Times New Roman"/>
-          <w:b/>
-          <w:bCs/>
-          <w:sz w:val="28"/>
-          <w:szCs w:val="28"/>
-        </w:rPr>
-        <w:t>không</w:t>
-      </w:r>
-      <w:proofErr w:type="spellEnd"/>
-      <w:r>
-        <w:rPr>
-          <w:rFonts w:ascii="Times New Roman" w:hAnsi="Times New Roman"/>
-          <w:b/>
-          <w:bCs/>
-          <w:sz w:val="28"/>
-          <w:szCs w:val="28"/>
-        </w:rPr>
-        <w:t xml:space="preserve"> </w:t>
-      </w:r>
-      <w:proofErr w:type="spellStart"/>
-      <w:r>
-        <w:rPr>
-          <w:rFonts w:ascii="Times New Roman" w:hAnsi="Times New Roman"/>
-          <w:b/>
-          <w:bCs/>
-          <w:sz w:val="28"/>
-          <w:szCs w:val="28"/>
-        </w:rPr>
-        <w:t>hoàn</w:t>
-      </w:r>
-      <w:proofErr w:type="spellEnd"/>
-      <w:r>
-        <w:rPr>
-          <w:rFonts w:ascii="Times New Roman" w:hAnsi="Times New Roman"/>
-          <w:b/>
-          <w:bCs/>
-          <w:sz w:val="28"/>
-          <w:szCs w:val="28"/>
-        </w:rPr>
-        <w:t xml:space="preserve"> </w:t>
-      </w:r>
-      <w:proofErr w:type="spellStart"/>
-      <w:r>
-        <w:rPr>
-          <w:rFonts w:ascii="Times New Roman" w:hAnsi="Times New Roman"/>
-          <w:b/>
-          <w:bCs/>
-          <w:sz w:val="28"/>
-          <w:szCs w:val="28"/>
-        </w:rPr>
-        <w:t>thành</w:t>
-      </w:r>
-      <w:proofErr w:type="spellEnd"/>
-      <w:r>
-        <w:rPr>
-          <w:rFonts w:ascii="Times New Roman" w:hAnsi="Times New Roman"/>
-          <w:b/>
-          <w:bCs/>
-          <w:sz w:val="28"/>
-          <w:szCs w:val="28"/>
-        </w:rPr>
-        <w:t xml:space="preserve"> </w:t>
-      </w:r>
-      <w:proofErr w:type="spellStart"/>
-      <w:r>
-        <w:rPr>
-          <w:rFonts w:ascii="Times New Roman" w:hAnsi="Times New Roman"/>
-          <w:b/>
-          <w:bCs/>
-          <w:sz w:val="28"/>
-          <w:szCs w:val="28"/>
-        </w:rPr>
-        <w:t>thực</w:t>
-      </w:r>
-      <w:proofErr w:type="spellEnd"/>
-      <w:r>
-        <w:rPr>
-          <w:rFonts w:ascii="Times New Roman" w:hAnsi="Times New Roman"/>
-          <w:b/>
-          <w:bCs/>
-          <w:sz w:val="28"/>
-          <w:szCs w:val="28"/>
-        </w:rPr>
-        <w:t xml:space="preserve"> </w:t>
-      </w:r>
-      <w:proofErr w:type="spellStart"/>
-      <w:r>
-        <w:rPr>
-          <w:rFonts w:ascii="Times New Roman" w:hAnsi="Times New Roman"/>
-          <w:b/>
-          <w:bCs/>
-          <w:sz w:val="28"/>
-          <w:szCs w:val="28"/>
-        </w:rPr>
-        <w:t>tập</w:t>
-      </w:r>
-      <w:proofErr w:type="spellEnd"/>
+        <w:t>Danh sách sinh viên không hoàn thành thực tập</w:t>
+      </w:r>
     </w:p>
     <w:tbl>
       <w:tblPr>
@@ -3512,15 +2187,7 @@
               </w:rPr>
             </w:pPr>
             <w:r>
-              <w:t>{</w:t>
-            </w:r>
-            <w:proofErr w:type="spellStart"/>
-            <w:r>
-              <w:t>mssv</w:t>
-            </w:r>
-            <w:proofErr w:type="spellEnd"/>
-            <w:r>
-              <w:t>}</w:t>
+              <w:t>{mssv}</w:t>
             </w:r>
           </w:p>
         </w:tc>
@@ -3637,31 +2304,15 @@
               </w:rPr>
             </w:pPr>
             <w:r>
-              <w:t>{</w:t>
-            </w:r>
-            <w:proofErr w:type="spellStart"/>
-            <w:r>
-              <w:t>ly_</w:t>
+              <w:t>{ly_</w:t>
             </w:r>
             <w:proofErr w:type="gramStart"/>
             <w:r>
-              <w:t>do</w:t>
-            </w:r>
-            <w:proofErr w:type="spellEnd"/>
-            <w:r>
-              <w:t>}{</w:t>
+              <w:t>do}{</w:t>
             </w:r>
             <w:proofErr w:type="gramEnd"/>
             <w:r>
-              <w:t>/</w:t>
-            </w:r>
-            <w:proofErr w:type="spellStart"/>
-            <w:r>
-              <w:t>ds_khong_hoan_thanh</w:t>
-            </w:r>
-            <w:proofErr w:type="spellEnd"/>
-            <w:r>
-              <w:t>}</w:t>
+              <w:t>/ds_khong_hoan_thanh}</w:t>
             </w:r>
           </w:p>
         </w:tc>
@@ -5255,6 +3906,7 @@
   <w:style w:type="character" w:default="1" w:styleId="DefaultParagraphFont">
     <w:name w:val="Default Paragraph Font"/>
     <w:uiPriority w:val="1"/>
+    <w:semiHidden/>
     <w:unhideWhenUsed/>
   </w:style>
   <w:style w:type="table" w:default="1" w:styleId="TableNormal">
@@ -5354,6 +4006,25 @@
     <w:link w:val="Footer"/>
     <w:uiPriority w:val="99"/>
     <w:rsid w:val="00C77FC2"/>
+  </w:style>
+  <w:style w:type="table" w:styleId="TableGrid">
+    <w:name w:val="Table Grid"/>
+    <w:basedOn w:val="TableNormal"/>
+    <w:uiPriority w:val="39"/>
+    <w:rsid w:val="00CA1875"/>
+    <w:pPr>
+      <w:spacing w:after="0" w:line="240" w:lineRule="auto"/>
+    </w:pPr>
+    <w:tblPr>
+      <w:tblBorders>
+        <w:top w:val="single" w:sz="4" w:space="0" w:color="auto"/>
+        <w:left w:val="single" w:sz="4" w:space="0" w:color="auto"/>
+        <w:bottom w:val="single" w:sz="4" w:space="0" w:color="auto"/>
+        <w:right w:val="single" w:sz="4" w:space="0" w:color="auto"/>
+        <w:insideH w:val="single" w:sz="4" w:space="0" w:color="auto"/>
+        <w:insideV w:val="single" w:sz="4" w:space="0" w:color="auto"/>
+      </w:tblBorders>
+    </w:tblPr>
   </w:style>
 </w:styles>
 </file>

</xml_diff>